<commit_message>
Publica template Litoral Norte por Marcos
</commit_message>
<xml_diff>
--- a/templates/litoral_norte.docx
+++ b/templates/litoral_norte.docx
@@ -69,8 +69,15 @@
           <w:b w:val="0"/>
           <w:sz w:val="20"/>
         </w:rPr>
-        <w:t>SINDICATO DE HOTÉIS, RESTAURANTES, BARES E UBATUBA - SINHORES (a/c.: Fernanda)</w:t>
+        <w:t>SINDICATO DE HOTÉIS, RESTAURANTES, BARES E UBATUBA - SINHORES (a/c.:Fernanda)</w:t>
       </w:r>
+    </w:p>
+    <w:p>
+      <w:pPr>
+        <w:spacing w:before="0" w:after="0" w:line="240" w:lineRule="auto"/>
+        <w:jc w:val="both"/>
+      </w:pPr>
+      <w:r/>
     </w:p>
     <w:p>
       <w:pPr>
@@ -83,7 +90,23 @@
           <w:b w:val="0"/>
           <w:sz w:val="20"/>
         </w:rPr>
-        <w:t xml:space="preserve">Declaramos que a empresa {{EMPRESA}} - {{CNPJ}}, está de acordo com a ATUALIZAÇÃO da CCT do Litoral Norte e Região, tendo contrato o </w:t>
+        <w:t xml:space="preserve">Declaramos que a empresa </w:t>
+      </w:r>
+      <w:r>
+        <w:rPr>
+          <w:rFonts w:ascii="Arial" w:hAnsi="Arial" w:eastAsia="Arial" w:cs="Arial"/>
+          <w:b/>
+          <w:sz w:val="20"/>
+        </w:rPr>
+        <w:t>{{EMPRESA}} - {{CNPJ}}</w:t>
+      </w:r>
+      <w:r>
+        <w:rPr>
+          <w:rFonts w:ascii="Arial" w:hAnsi="Arial" w:eastAsia="Arial" w:cs="Arial"/>
+          <w:b w:val="0"/>
+          <w:sz w:val="20"/>
+        </w:rPr>
+        <w:t xml:space="preserve">, está de acordo com a ATUALIZAÇÃO da CCT do Litoral Norte e Região, tendo contrato o </w:t>
       </w:r>
       <w:r>
         <w:rPr>
@@ -107,6 +130,13 @@
         <w:spacing w:before="0" w:after="0" w:line="240" w:lineRule="auto"/>
         <w:jc w:val="both"/>
       </w:pPr>
+      <w:r/>
+    </w:p>
+    <w:p>
+      <w:pPr>
+        <w:spacing w:before="0" w:after="0" w:line="240" w:lineRule="auto"/>
+        <w:jc w:val="both"/>
+      </w:pPr>
       <w:r>
         <w:rPr>
           <w:rFonts w:ascii="Arial" w:hAnsi="Arial" w:eastAsia="Arial" w:cs="Arial"/>
@@ -115,6 +145,13 @@
         </w:rPr>
         <w:t>A ATUALIZAÇÃO da apólice foi formalizada mediante o pagamento do boleto pago em {{PAGTO}}.</w:t>
       </w:r>
+    </w:p>
+    <w:p>
+      <w:pPr>
+        <w:spacing w:before="0" w:after="0" w:line="240" w:lineRule="auto"/>
+        <w:jc w:val="both"/>
+      </w:pPr>
+      <w:r/>
     </w:p>
     <w:p>
       <w:pPr>
@@ -143,6 +180,13 @@
         </w:rPr>
         <w:t>A Cesta de Benefícios está ativa para os colaboradores abaixo:</w:t>
       </w:r>
+    </w:p>
+    <w:p>
+      <w:pPr>
+        <w:spacing w:before="0" w:after="0" w:line="240" w:lineRule="auto"/>
+        <w:jc w:val="both"/>
+      </w:pPr>
+      <w:r/>
     </w:p>
     <w:p>
       <w:pPr>

</xml_diff>